<commit_message>
docs(report): fix figure paths and the unit test count
Points the figures to the files at the repository root and corrects the unit test cases from 18 to 15.
</commit_message>
<xml_diff>
--- a/RELATORIO_3VA.docx
+++ b/RELATORIO_3VA.docx
@@ -558,7 +558,7 @@
               <a:graphicData uri="http://schemas.openxmlformats.org/drawingml/2006/picture">
                 <pic:pic>
                   <pic:nvPicPr>
-                    <pic:cNvPr descr="docs/diagrama-3va.png" id="23" name="Picture"/>
+                    <pic:cNvPr descr="diagrama-3va.png" id="23" name="Picture"/>
                     <pic:cNvPicPr>
                       <a:picLocks noChangeArrowheads="1" noChangeAspect="1"/>
                     </pic:cNvPicPr>
@@ -1431,7 +1431,7 @@
               <a:graphicData uri="http://schemas.openxmlformats.org/drawingml/2006/picture">
                 <pic:pic>
                   <pic:nvPicPr>
-                    <pic:cNvPr descr="docs/arquitetura-3va.png" id="29" name="Picture"/>
+                    <pic:cNvPr descr="arquitetura-3va.png" id="29" name="Picture"/>
                     <pic:cNvPicPr>
                       <a:picLocks noChangeArrowheads="1" noChangeAspect="1"/>
                     </pic:cNvPicPr>
@@ -4255,7 +4255,7 @@
               <w:jc w:val="left"/>
             </w:pPr>
             <w:r>
-              <w:t xml:space="preserve">Teste unitário (18 casos)</w:t>
+              <w:t xml:space="preserve">Teste unitário (15 casos)</w:t>
             </w:r>
           </w:p>
         </w:tc>

</xml_diff>